<commit_message>
update the name of the file
</commit_message>
<xml_diff>
--- a/Documents/Documents from Team/Data Quality Assessment – Users and Ratings_Dataset.docx
+++ b/Documents/Documents from Team/Data Quality Assessment – Users and Ratings_Dataset.docx
@@ -8,18 +8,20 @@
         <w:rPr>
           <w:b/>
           <w:bCs/>
-          <w:sz w:val="28"/>
-          <w:szCs w:val="28"/>
+          <w:sz w:val="32"/>
+          <w:szCs w:val="32"/>
+          <w:u w:val="single"/>
         </w:rPr>
       </w:pPr>
       <w:r>
         <w:rPr>
           <w:b/>
           <w:bCs/>
-          <w:sz w:val="28"/>
-          <w:szCs w:val="28"/>
+          <w:sz w:val="32"/>
+          <w:szCs w:val="32"/>
+          <w:u w:val="single"/>
         </w:rPr>
-        <w:t>Data Quality Assessment</w:t>
+        <w:t>Assess data quality, completeness, and any anomalies.</w:t>
       </w:r>
     </w:p>
     <w:p>
@@ -420,7 +422,7 @@
     <w:p>
       <w:r>
         <w:pict w14:anchorId="4EAEC891">
-          <v:rect id="_x0000_i1133" style="width:0;height:1.5pt" o:hralign="center" o:hrstd="t" o:hr="t" fillcolor="#a0a0a0" stroked="f"/>
+          <v:rect id="_x0000_i1025" style="width:0;height:1.5pt" o:hralign="center" o:hrstd="t" o:hr="t" fillcolor="#a0a0a0" stroked="f"/>
         </w:pict>
       </w:r>
     </w:p>
@@ -811,7 +813,7 @@
     <w:p>
       <w:r>
         <w:pict w14:anchorId="2251303B">
-          <v:rect id="_x0000_i1134" style="width:0;height:1.5pt" o:hralign="center" o:hrstd="t" o:hr="t" fillcolor="#a0a0a0" stroked="f"/>
+          <v:rect id="_x0000_i1026" style="width:0;height:1.5pt" o:hralign="center" o:hrstd="t" o:hr="t" fillcolor="#a0a0a0" stroked="f"/>
         </w:pict>
       </w:r>
     </w:p>
@@ -1066,7 +1068,7 @@
     <w:p>
       <w:r>
         <w:pict w14:anchorId="1FB3FAD6">
-          <v:rect id="_x0000_i1135" style="width:0;height:1.5pt" o:hralign="center" o:hrstd="t" o:hr="t" fillcolor="#a0a0a0" stroked="f"/>
+          <v:rect id="_x0000_i1027" style="width:0;height:1.5pt" o:hralign="center" o:hrstd="t" o:hr="t" fillcolor="#a0a0a0" stroked="f"/>
         </w:pict>
       </w:r>
     </w:p>
@@ -1548,7 +1550,7 @@
     <w:p>
       <w:r>
         <w:pict w14:anchorId="56AAAE72">
-          <v:rect id="_x0000_i1136" style="width:0;height:1.5pt" o:hralign="center" o:hrstd="t" o:hr="t" fillcolor="#a0a0a0" stroked="f"/>
+          <v:rect id="_x0000_i1028" style="width:0;height:1.5pt" o:hralign="center" o:hrstd="t" o:hr="t" fillcolor="#a0a0a0" stroked="f"/>
         </w:pict>
       </w:r>
     </w:p>

</xml_diff>